<commit_message>
S04 Ex.2: enriquecer QUAR (SIADAP 1) e objetivos do dirigente (SIADAP 2)
QUAR com 6 objetivos por Eficacia/Eficiencia/Qualidade, cada um com meta,
tolerancia, valor critico, peso e fonte. SIADAP 2 com cascata explicita
para o QUAR (coluna Contributo) + parametro Competencias. Metas calibradas
para gabarito variado (3 cumpridos / 2 parciais / 1 nao cumprido),
verificado contra os Excel. Sem gabarito embebido nos ficheiros.

Co-Authored-By: Claude Opus 4.8 (1M context) <noreply@anthropic.com>
</commit_message>
<xml_diff>
--- a/sessoes/sessao-04/SA_SIADAP1_QUAR_2026.docx
+++ b/sessoes/sessao-04/SA_SIADAP1_QUAR_2026.docx
@@ -12,70 +12,220 @@
     </w:p>
     <w:p>
       <w:r>
-        <w:t>Quadro de Avaliação e Responsabilização do serviço. Define os objetivos, indicadores e metas do ano. O grau de cumprimento apura-se com os dados de execução (ficheiros de Processos e Atendimentos).</w:t>
+        <w:t>Quadro de Avaliação e Responsabilização (QUAR) do serviço, no âmbito do SIADAP 1. Fixa, para o ciclo de gestão 2025/2026, os objetivos operacionais do serviço repartidos pelos parâmetros Eficácia, Eficiência e Qualidade, com os respetivos indicadores, metas, tolerâncias, valores críticos de superação, ponderações e fontes de verificação.</w:t>
+      </w:r>
+    </w:p>
+    <w:p>
+      <w:r>
+        <w:rPr>
+          <w:b/>
+        </w:rPr>
+        <w:t xml:space="preserve">Missão. </w:t>
+      </w:r>
+      <w:r>
+        <w:t>Assegurar a gestão académica do percurso dos estudantes — matrículas, inscrições, certidões, equivalências, mobilidade, diplomas e regimes especiais — garantindo resposta tempestiva, rigorosa e de qualidade aos utentes da Universidade.</w:t>
+      </w:r>
+    </w:p>
+    <w:p>
+      <w:pPr>
+        <w:pStyle w:val="Heading1"/>
+      </w:pPr>
+      <w:r>
+        <w:t>Objetivos estratégicos do serviço</w:t>
+      </w:r>
+    </w:p>
+    <w:p>
+      <w:pPr>
+        <w:pStyle w:val="ListBullet"/>
+      </w:pPr>
+      <w:r>
+        <w:t>Responder com tempestividade ao volume de processos, mesmo nos períodos de maior pressão.</w:t>
+      </w:r>
+    </w:p>
+    <w:p>
+      <w:pPr>
+        <w:pStyle w:val="ListBullet"/>
+      </w:pPr>
+      <w:r>
+        <w:t>Reduzir os prazos de resposta e aproximar o serviço dos utentes através dos canais digitais.</w:t>
+      </w:r>
+    </w:p>
+    <w:p>
+      <w:pPr>
+        <w:pStyle w:val="ListBullet"/>
+      </w:pPr>
+      <w:r>
+        <w:t>Elevar a satisfação dos utentes e a qualidade do atendimento em todos os canais.</w:t>
+      </w:r>
+    </w:p>
+    <w:p>
+      <w:pPr>
+        <w:pStyle w:val="Heading1"/>
+      </w:pPr>
+      <w:r>
+        <w:t>Quadro de objetivos, indicadores e metas</w:t>
       </w:r>
     </w:p>
     <w:tbl>
       <w:tblPr>
-        <w:tblStyle w:val="LightGrid-Accent1"/>
+        <w:tblStyle w:val="TableGrid"/>
         <w:tblW w:type="auto" w:w="0"/>
         <w:tblLook w:firstColumn="1" w:firstRow="1" w:lastColumn="0" w:lastRow="0" w:noHBand="0" w:noVBand="1" w:val="04A0"/>
       </w:tblPr>
       <w:tblGrid>
-        <w:gridCol w:w="1728"/>
-        <w:gridCol w:w="1728"/>
-        <w:gridCol w:w="1728"/>
-        <w:gridCol w:w="1728"/>
-        <w:gridCol w:w="1728"/>
+        <w:gridCol w:w="1234"/>
+        <w:gridCol w:w="1234"/>
+        <w:gridCol w:w="1234"/>
+        <w:gridCol w:w="1234"/>
+        <w:gridCol w:w="1234"/>
+        <w:gridCol w:w="1234"/>
+        <w:gridCol w:w="1234"/>
       </w:tblGrid>
       <w:tr>
         <w:tc>
           <w:tcPr>
-            <w:tcW w:type="dxa" w:w="1728"/>
+            <w:tcW w:type="dxa" w:w="1234"/>
+            <w:shd w:val="clear" w:color="auto" w:fill="1F4E79"/>
           </w:tcPr>
           <w:p>
+            <w:pPr>
+              <w:spacing w:after="20" w:before="20"/>
+            </w:pPr>
+            <w:r/>
             <w:r>
-              <w:t>Parâmetro</w:t>
+              <w:rPr>
+                <w:b/>
+                <w:i w:val="0"/>
+                <w:color w:val="FFFFFF"/>
+                <w:sz w:val="17"/>
+              </w:rPr>
+              <w:t>Objetivo operacional</w:t>
             </w:r>
           </w:p>
         </w:tc>
         <w:tc>
           <w:tcPr>
-            <w:tcW w:type="dxa" w:w="1728"/>
+            <w:tcW w:type="dxa" w:w="1234"/>
+            <w:shd w:val="clear" w:color="auto" w:fill="1F4E79"/>
           </w:tcPr>
           <w:p>
+            <w:pPr>
+              <w:spacing w:after="20" w:before="20"/>
+            </w:pPr>
+            <w:r/>
             <w:r>
-              <w:t>Objetivo</w:t>
-            </w:r>
-          </w:p>
-        </w:tc>
-        <w:tc>
-          <w:tcPr>
-            <w:tcW w:type="dxa" w:w="1728"/>
-          </w:tcPr>
-          <w:p>
-            <w:r>
+              <w:rPr>
+                <w:b/>
+                <w:i w:val="0"/>
+                <w:color w:val="FFFFFF"/>
+                <w:sz w:val="17"/>
+              </w:rPr>
               <w:t>Indicador</w:t>
             </w:r>
           </w:p>
         </w:tc>
         <w:tc>
           <w:tcPr>
-            <w:tcW w:type="dxa" w:w="1728"/>
+            <w:tcW w:type="dxa" w:w="1234"/>
+            <w:shd w:val="clear" w:color="auto" w:fill="1F4E79"/>
           </w:tcPr>
           <w:p>
+            <w:pPr>
+              <w:spacing w:after="20" w:before="20"/>
+            </w:pPr>
+            <w:r/>
             <w:r>
+              <w:rPr>
+                <w:b/>
+                <w:i w:val="0"/>
+                <w:color w:val="FFFFFF"/>
+                <w:sz w:val="17"/>
+              </w:rPr>
               <w:t>Meta</w:t>
             </w:r>
           </w:p>
         </w:tc>
         <w:tc>
           <w:tcPr>
-            <w:tcW w:type="dxa" w:w="1728"/>
+            <w:tcW w:type="dxa" w:w="1234"/>
+            <w:shd w:val="clear" w:color="auto" w:fill="1F4E79"/>
           </w:tcPr>
           <w:p>
+            <w:pPr>
+              <w:spacing w:after="20" w:before="20"/>
+            </w:pPr>
+            <w:r/>
             <w:r>
+              <w:rPr>
+                <w:b/>
+                <w:i w:val="0"/>
+                <w:color w:val="FFFFFF"/>
+                <w:sz w:val="17"/>
+              </w:rPr>
+              <w:t>Tolerância</w:t>
+            </w:r>
+          </w:p>
+        </w:tc>
+        <w:tc>
+          <w:tcPr>
+            <w:tcW w:type="dxa" w:w="1234"/>
+            <w:shd w:val="clear" w:color="auto" w:fill="1F4E79"/>
+          </w:tcPr>
+          <w:p>
+            <w:pPr>
+              <w:spacing w:after="20" w:before="20"/>
+            </w:pPr>
+            <w:r/>
+            <w:r>
+              <w:rPr>
+                <w:b/>
+                <w:i w:val="0"/>
+                <w:color w:val="FFFFFF"/>
+                <w:sz w:val="17"/>
+              </w:rPr>
+              <w:t>Valor crítico (superação)</w:t>
+            </w:r>
+          </w:p>
+        </w:tc>
+        <w:tc>
+          <w:tcPr>
+            <w:tcW w:type="dxa" w:w="1234"/>
+            <w:shd w:val="clear" w:color="auto" w:fill="1F4E79"/>
+          </w:tcPr>
+          <w:p>
+            <w:pPr>
+              <w:spacing w:after="20" w:before="20"/>
+            </w:pPr>
+            <w:r/>
+            <w:r>
+              <w:rPr>
+                <w:b/>
+                <w:i w:val="0"/>
+                <w:color w:val="FFFFFF"/>
+                <w:sz w:val="17"/>
+              </w:rPr>
               <w:t>Peso</w:t>
+            </w:r>
+          </w:p>
+        </w:tc>
+        <w:tc>
+          <w:tcPr>
+            <w:tcW w:type="dxa" w:w="1234"/>
+            <w:shd w:val="clear" w:color="auto" w:fill="1F4E79"/>
+          </w:tcPr>
+          <w:p>
+            <w:pPr>
+              <w:spacing w:after="20" w:before="20"/>
+            </w:pPr>
+            <w:r/>
+            <w:r>
+              <w:rPr>
+                <w:b/>
+                <w:i w:val="0"/>
+                <w:color w:val="FFFFFF"/>
+                <w:sz w:val="17"/>
+              </w:rPr>
+              <w:t>Fonte de verificação</w:t>
             </w:r>
           </w:p>
         </w:tc>
@@ -83,51 +233,22 @@
       <w:tr>
         <w:tc>
           <w:tcPr>
-            <w:tcW w:type="dxa" w:w="1728"/>
+            <w:tcW w:type="dxa" w:w="8638"/>
+            <w:gridSpan w:val="7"/>
+            <w:shd w:val="clear" w:color="auto" w:fill="D9E1F2"/>
           </w:tcPr>
           <w:p>
+            <w:pPr>
+              <w:spacing w:after="20" w:before="20"/>
+            </w:pPr>
+            <w:r/>
             <w:r>
-              <w:t>Eficácia</w:t>
-            </w:r>
-          </w:p>
-        </w:tc>
-        <w:tc>
-          <w:tcPr>
-            <w:tcW w:type="dxa" w:w="1728"/>
-          </w:tcPr>
-          <w:p>
-            <w:r>
-              <w:t>Assegurar a conclusão tempestiva dos processos</w:t>
-            </w:r>
-          </w:p>
-        </w:tc>
-        <w:tc>
-          <w:tcPr>
-            <w:tcW w:type="dxa" w:w="1728"/>
-          </w:tcPr>
-          <w:p>
-            <w:r>
-              <w:t>Taxa de conclusão de processos no ano</w:t>
-            </w:r>
-          </w:p>
-        </w:tc>
-        <w:tc>
-          <w:tcPr>
-            <w:tcW w:type="dxa" w:w="1728"/>
-          </w:tcPr>
-          <w:p>
-            <w:r>
-              <w:t>≥ 92%</w:t>
-            </w:r>
-          </w:p>
-        </w:tc>
-        <w:tc>
-          <w:tcPr>
-            <w:tcW w:type="dxa" w:w="1728"/>
-          </w:tcPr>
-          <w:p>
-            <w:r>
-              <w:t>25%</w:t>
+              <w:rPr>
+                <w:b/>
+                <w:i w:val="0"/>
+                <w:sz w:val="18"/>
+              </w:rPr>
+              <w:t>Parâmetro: EFICÁCIA — ponderação 40%</w:t>
             </w:r>
           </w:p>
         </w:tc>
@@ -135,51 +256,134 @@
       <w:tr>
         <w:tc>
           <w:tcPr>
-            <w:tcW w:type="dxa" w:w="1728"/>
+            <w:tcW w:type="dxa" w:w="1234"/>
           </w:tcPr>
           <w:p>
+            <w:pPr>
+              <w:spacing w:after="20" w:before="20"/>
+            </w:pPr>
+            <w:r/>
             <w:r>
-              <w:t>Eficácia</w:t>
+              <w:rPr>
+                <w:b w:val="0"/>
+                <w:i w:val="0"/>
+                <w:sz w:val="17"/>
+              </w:rPr>
+              <w:t>OOp 1. Assegurar a conclusão tempestiva dos processos</w:t>
             </w:r>
           </w:p>
         </w:tc>
         <w:tc>
           <w:tcPr>
-            <w:tcW w:type="dxa" w:w="1728"/>
+            <w:tcW w:type="dxa" w:w="1234"/>
           </w:tcPr>
           <w:p>
+            <w:pPr>
+              <w:spacing w:after="20" w:before="20"/>
+            </w:pPr>
+            <w:r/>
             <w:r>
-              <w:t>Acelerar a emissão de certidões</w:t>
+              <w:rPr>
+                <w:b w:val="0"/>
+                <w:i w:val="0"/>
+                <w:sz w:val="17"/>
+              </w:rPr>
+              <w:t>Taxa de conclusão de processos no ano</w:t>
             </w:r>
           </w:p>
         </w:tc>
         <w:tc>
           <w:tcPr>
-            <w:tcW w:type="dxa" w:w="1728"/>
+            <w:tcW w:type="dxa" w:w="1234"/>
           </w:tcPr>
           <w:p>
+            <w:pPr>
+              <w:spacing w:after="20" w:before="20"/>
+            </w:pPr>
+            <w:r/>
             <w:r>
-              <w:t>Prazo médio de emissão de certidões</w:t>
+              <w:rPr>
+                <w:b w:val="0"/>
+                <w:i w:val="0"/>
+                <w:sz w:val="17"/>
+              </w:rPr>
+              <w:t>≥ 92%</w:t>
             </w:r>
           </w:p>
         </w:tc>
         <w:tc>
           <w:tcPr>
-            <w:tcW w:type="dxa" w:w="1728"/>
+            <w:tcW w:type="dxa" w:w="1234"/>
           </w:tcPr>
           <w:p>
+            <w:pPr>
+              <w:spacing w:after="20" w:before="20"/>
+            </w:pPr>
+            <w:r/>
             <w:r>
-              <w:t>≤ 5 dias úteis</w:t>
+              <w:rPr>
+                <w:b w:val="0"/>
+                <w:i w:val="0"/>
+                <w:sz w:val="17"/>
+              </w:rPr>
+              <w:t>90%</w:t>
             </w:r>
           </w:p>
         </w:tc>
         <w:tc>
           <w:tcPr>
-            <w:tcW w:type="dxa" w:w="1728"/>
+            <w:tcW w:type="dxa" w:w="1234"/>
           </w:tcPr>
           <w:p>
+            <w:pPr>
+              <w:spacing w:after="20" w:before="20"/>
+            </w:pPr>
+            <w:r/>
             <w:r>
-              <w:t>15%</w:t>
+              <w:rPr>
+                <w:b w:val="0"/>
+                <w:i w:val="0"/>
+                <w:sz w:val="17"/>
+              </w:rPr>
+              <w:t>96%</w:t>
+            </w:r>
+          </w:p>
+        </w:tc>
+        <w:tc>
+          <w:tcPr>
+            <w:tcW w:type="dxa" w:w="1234"/>
+          </w:tcPr>
+          <w:p>
+            <w:pPr>
+              <w:spacing w:after="20" w:before="20"/>
+            </w:pPr>
+            <w:r/>
+            <w:r>
+              <w:rPr>
+                <w:b w:val="0"/>
+                <w:i w:val="0"/>
+                <w:sz w:val="17"/>
+              </w:rPr>
+              <w:t>20%</w:t>
+            </w:r>
+          </w:p>
+        </w:tc>
+        <w:tc>
+          <w:tcPr>
+            <w:tcW w:type="dxa" w:w="1234"/>
+          </w:tcPr>
+          <w:p>
+            <w:pPr>
+              <w:spacing w:after="20" w:before="20"/>
+            </w:pPr>
+            <w:r/>
+            <w:r>
+              <w:rPr>
+                <w:b w:val="0"/>
+                <w:i w:val="0"/>
+                <w:sz w:val="17"/>
+              </w:rPr>
+              <w:t>Ficheiro de Processos (entrados/concluídos)</w:t>
             </w:r>
           </w:p>
         </w:tc>
@@ -187,51 +391,134 @@
       <w:tr>
         <w:tc>
           <w:tcPr>
-            <w:tcW w:type="dxa" w:w="1728"/>
+            <w:tcW w:type="dxa" w:w="1234"/>
           </w:tcPr>
           <w:p>
+            <w:pPr>
+              <w:spacing w:after="20" w:before="20"/>
+            </w:pPr>
+            <w:r/>
             <w:r>
-              <w:t>Eficiência</w:t>
+              <w:rPr>
+                <w:b w:val="0"/>
+                <w:i w:val="0"/>
+                <w:sz w:val="17"/>
+              </w:rPr>
+              <w:t>OOp 2. Garantir a resposta no período de maior pressão</w:t>
             </w:r>
           </w:p>
         </w:tc>
         <w:tc>
           <w:tcPr>
-            <w:tcW w:type="dxa" w:w="1728"/>
+            <w:tcW w:type="dxa" w:w="1234"/>
           </w:tcPr>
           <w:p>
+            <w:pPr>
+              <w:spacing w:after="20" w:before="20"/>
+            </w:pPr>
+            <w:r/>
             <w:r>
-              <w:t>Melhorar o prazo de resposta global</w:t>
+              <w:rPr>
+                <w:b w:val="0"/>
+                <w:i w:val="0"/>
+                <w:sz w:val="17"/>
+              </w:rPr>
+              <w:t>Taxa de conclusão nos meses de pico (setembro + outubro)</w:t>
             </w:r>
           </w:p>
         </w:tc>
         <w:tc>
           <w:tcPr>
-            <w:tcW w:type="dxa" w:w="1728"/>
+            <w:tcW w:type="dxa" w:w="1234"/>
           </w:tcPr>
           <w:p>
+            <w:pPr>
+              <w:spacing w:after="20" w:before="20"/>
+            </w:pPr>
+            <w:r/>
             <w:r>
-              <w:t>Prazo médio de conclusão de processos</w:t>
+              <w:rPr>
+                <w:b w:val="0"/>
+                <w:i w:val="0"/>
+                <w:sz w:val="17"/>
+              </w:rPr>
+              <w:t>≥ 90%</w:t>
             </w:r>
           </w:p>
         </w:tc>
         <w:tc>
           <w:tcPr>
-            <w:tcW w:type="dxa" w:w="1728"/>
+            <w:tcW w:type="dxa" w:w="1234"/>
           </w:tcPr>
           <w:p>
+            <w:pPr>
+              <w:spacing w:after="20" w:before="20"/>
+            </w:pPr>
+            <w:r/>
             <w:r>
-              <w:t>≤ 12 dias úteis</w:t>
+              <w:rPr>
+                <w:b w:val="0"/>
+                <w:i w:val="0"/>
+                <w:sz w:val="17"/>
+              </w:rPr>
+              <w:t>86%</w:t>
             </w:r>
           </w:p>
         </w:tc>
         <w:tc>
           <w:tcPr>
-            <w:tcW w:type="dxa" w:w="1728"/>
+            <w:tcW w:type="dxa" w:w="1234"/>
           </w:tcPr>
           <w:p>
+            <w:pPr>
+              <w:spacing w:after="20" w:before="20"/>
+            </w:pPr>
+            <w:r/>
             <w:r>
-              <w:t>25%</w:t>
+              <w:rPr>
+                <w:b w:val="0"/>
+                <w:i w:val="0"/>
+                <w:sz w:val="17"/>
+              </w:rPr>
+              <w:t>93%</w:t>
+            </w:r>
+          </w:p>
+        </w:tc>
+        <w:tc>
+          <w:tcPr>
+            <w:tcW w:type="dxa" w:w="1234"/>
+          </w:tcPr>
+          <w:p>
+            <w:pPr>
+              <w:spacing w:after="20" w:before="20"/>
+            </w:pPr>
+            <w:r/>
+            <w:r>
+              <w:rPr>
+                <w:b w:val="0"/>
+                <w:i w:val="0"/>
+                <w:sz w:val="17"/>
+              </w:rPr>
+              <w:t>10%</w:t>
+            </w:r>
+          </w:p>
+        </w:tc>
+        <w:tc>
+          <w:tcPr>
+            <w:tcW w:type="dxa" w:w="1234"/>
+          </w:tcPr>
+          <w:p>
+            <w:pPr>
+              <w:spacing w:after="20" w:before="20"/>
+            </w:pPr>
+            <w:r/>
+            <w:r>
+              <w:rPr>
+                <w:b w:val="0"/>
+                <w:i w:val="0"/>
+                <w:sz w:val="17"/>
+              </w:rPr>
+              <w:t>Ficheiro de Processos (set+out)</w:t>
             </w:r>
           </w:p>
         </w:tc>
@@ -239,51 +526,134 @@
       <w:tr>
         <w:tc>
           <w:tcPr>
-            <w:tcW w:type="dxa" w:w="1728"/>
+            <w:tcW w:type="dxa" w:w="1234"/>
           </w:tcPr>
           <w:p>
+            <w:pPr>
+              <w:spacing w:after="20" w:before="20"/>
+            </w:pPr>
+            <w:r/>
             <w:r>
-              <w:t>Qualidade</w:t>
+              <w:rPr>
+                <w:b w:val="0"/>
+                <w:i w:val="0"/>
+                <w:sz w:val="17"/>
+              </w:rPr>
+              <w:t>OOp 3. Acelerar a emissão de certidões</w:t>
             </w:r>
           </w:p>
         </w:tc>
         <w:tc>
           <w:tcPr>
-            <w:tcW w:type="dxa" w:w="1728"/>
+            <w:tcW w:type="dxa" w:w="1234"/>
           </w:tcPr>
           <w:p>
+            <w:pPr>
+              <w:spacing w:after="20" w:before="20"/>
+            </w:pPr>
+            <w:r/>
             <w:r>
-              <w:t>Garantir a satisfação dos utentes</w:t>
+              <w:rPr>
+                <w:b w:val="0"/>
+                <w:i w:val="0"/>
+                <w:sz w:val="17"/>
+              </w:rPr>
+              <w:t>Prazo médio de emissão de certidões</w:t>
             </w:r>
           </w:p>
         </w:tc>
         <w:tc>
           <w:tcPr>
-            <w:tcW w:type="dxa" w:w="1728"/>
+            <w:tcW w:type="dxa" w:w="1234"/>
           </w:tcPr>
           <w:p>
+            <w:pPr>
+              <w:spacing w:after="20" w:before="20"/>
+            </w:pPr>
+            <w:r/>
             <w:r>
-              <w:t>Satisfação média no atendimento (escala 1-5)</w:t>
+              <w:rPr>
+                <w:b w:val="0"/>
+                <w:i w:val="0"/>
+                <w:sz w:val="17"/>
+              </w:rPr>
+              <w:t>≤ 5 dias úteis</w:t>
             </w:r>
           </w:p>
         </w:tc>
         <w:tc>
           <w:tcPr>
-            <w:tcW w:type="dxa" w:w="1728"/>
+            <w:tcW w:type="dxa" w:w="1234"/>
           </w:tcPr>
           <w:p>
+            <w:pPr>
+              <w:spacing w:after="20" w:before="20"/>
+            </w:pPr>
+            <w:r/>
             <w:r>
-              <w:t>≥ 4,0</w:t>
+              <w:rPr>
+                <w:b w:val="0"/>
+                <w:i w:val="0"/>
+                <w:sz w:val="17"/>
+              </w:rPr>
+              <w:t>≤ 6 dias úteis</w:t>
             </w:r>
           </w:p>
         </w:tc>
         <w:tc>
           <w:tcPr>
-            <w:tcW w:type="dxa" w:w="1728"/>
+            <w:tcW w:type="dxa" w:w="1234"/>
           </w:tcPr>
           <w:p>
+            <w:pPr>
+              <w:spacing w:after="20" w:before="20"/>
+            </w:pPr>
+            <w:r/>
             <w:r>
-              <w:t>20%</w:t>
+              <w:rPr>
+                <w:b w:val="0"/>
+                <w:i w:val="0"/>
+                <w:sz w:val="17"/>
+              </w:rPr>
+              <w:t>≤ 4 dias úteis</w:t>
+            </w:r>
+          </w:p>
+        </w:tc>
+        <w:tc>
+          <w:tcPr>
+            <w:tcW w:type="dxa" w:w="1234"/>
+          </w:tcPr>
+          <w:p>
+            <w:pPr>
+              <w:spacing w:after="20" w:before="20"/>
+            </w:pPr>
+            <w:r/>
+            <w:r>
+              <w:rPr>
+                <w:b w:val="0"/>
+                <w:i w:val="0"/>
+                <w:sz w:val="17"/>
+              </w:rPr>
+              <w:t>10%</w:t>
+            </w:r>
+          </w:p>
+        </w:tc>
+        <w:tc>
+          <w:tcPr>
+            <w:tcW w:type="dxa" w:w="1234"/>
+          </w:tcPr>
+          <w:p>
+            <w:pPr>
+              <w:spacing w:after="20" w:before="20"/>
+            </w:pPr>
+            <w:r/>
+            <w:r>
+              <w:rPr>
+                <w:b w:val="0"/>
+                <w:i w:val="0"/>
+                <w:sz w:val="17"/>
+              </w:rPr>
+              <w:t>Ficheiro de Processos (Certidões)</w:t>
             </w:r>
           </w:p>
         </w:tc>
@@ -291,56 +661,466 @@
       <w:tr>
         <w:tc>
           <w:tcPr>
-            <w:tcW w:type="dxa" w:w="1728"/>
+            <w:tcW w:type="dxa" w:w="8638"/>
+            <w:gridSpan w:val="7"/>
+            <w:shd w:val="clear" w:color="auto" w:fill="D9E1F2"/>
           </w:tcPr>
           <w:p>
+            <w:pPr>
+              <w:spacing w:after="20" w:before="20"/>
+            </w:pPr>
+            <w:r/>
             <w:r>
-              <w:t>Qualidade</w:t>
+              <w:rPr>
+                <w:b/>
+                <w:i w:val="0"/>
+                <w:sz w:val="18"/>
+              </w:rPr>
+              <w:t>Parâmetro: EFICIÊNCIA — ponderação 25%</w:t>
+            </w:r>
+          </w:p>
+        </w:tc>
+      </w:tr>
+      <w:tr>
+        <w:tc>
+          <w:tcPr>
+            <w:tcW w:type="dxa" w:w="1234"/>
+          </w:tcPr>
+          <w:p>
+            <w:pPr>
+              <w:spacing w:after="20" w:before="20"/>
+            </w:pPr>
+            <w:r/>
+            <w:r>
+              <w:rPr>
+                <w:b w:val="0"/>
+                <w:i w:val="0"/>
+                <w:sz w:val="17"/>
+              </w:rPr>
+              <w:t>OOp 4. Melhorar o prazo de resposta global do serviço</w:t>
             </w:r>
           </w:p>
         </w:tc>
         <w:tc>
           <w:tcPr>
-            <w:tcW w:type="dxa" w:w="1728"/>
+            <w:tcW w:type="dxa" w:w="1234"/>
           </w:tcPr>
           <w:p>
+            <w:pPr>
+              <w:spacing w:after="20" w:before="20"/>
+            </w:pPr>
+            <w:r/>
             <w:r>
-              <w:t>Promover os canais digitais</w:t>
+              <w:rPr>
+                <w:b w:val="0"/>
+                <w:i w:val="0"/>
+                <w:sz w:val="17"/>
+              </w:rPr>
+              <w:t>Prazo médio de conclusão de processos</w:t>
             </w:r>
           </w:p>
         </w:tc>
         <w:tc>
           <w:tcPr>
-            <w:tcW w:type="dxa" w:w="1728"/>
+            <w:tcW w:type="dxa" w:w="1234"/>
           </w:tcPr>
           <w:p>
+            <w:pPr>
+              <w:spacing w:after="20" w:before="20"/>
+            </w:pPr>
+            <w:r/>
             <w:r>
-              <w:t>% de atendimentos por canais digitais (portal + e-mail)</w:t>
+              <w:rPr>
+                <w:b w:val="0"/>
+                <w:i w:val="0"/>
+                <w:sz w:val="17"/>
+              </w:rPr>
+              <w:t>≤ 12 dias úteis</w:t>
             </w:r>
           </w:p>
         </w:tc>
         <w:tc>
           <w:tcPr>
-            <w:tcW w:type="dxa" w:w="1728"/>
+            <w:tcW w:type="dxa" w:w="1234"/>
           </w:tcPr>
           <w:p>
+            <w:pPr>
+              <w:spacing w:after="20" w:before="20"/>
+            </w:pPr>
+            <w:r/>
             <w:r>
+              <w:rPr>
+                <w:b w:val="0"/>
+                <w:i w:val="0"/>
+                <w:sz w:val="17"/>
+              </w:rPr>
+              <w:t>≤ 13 dias úteis</w:t>
+            </w:r>
+          </w:p>
+        </w:tc>
+        <w:tc>
+          <w:tcPr>
+            <w:tcW w:type="dxa" w:w="1234"/>
+          </w:tcPr>
+          <w:p>
+            <w:pPr>
+              <w:spacing w:after="20" w:before="20"/>
+            </w:pPr>
+            <w:r/>
+            <w:r>
+              <w:rPr>
+                <w:b w:val="0"/>
+                <w:i w:val="0"/>
+                <w:sz w:val="17"/>
+              </w:rPr>
+              <w:t>≤ 10 dias úteis</w:t>
+            </w:r>
+          </w:p>
+        </w:tc>
+        <w:tc>
+          <w:tcPr>
+            <w:tcW w:type="dxa" w:w="1234"/>
+          </w:tcPr>
+          <w:p>
+            <w:pPr>
+              <w:spacing w:after="20" w:before="20"/>
+            </w:pPr>
+            <w:r/>
+            <w:r>
+              <w:rPr>
+                <w:b w:val="0"/>
+                <w:i w:val="0"/>
+                <w:sz w:val="17"/>
+              </w:rPr>
+              <w:t>25%</w:t>
+            </w:r>
+          </w:p>
+        </w:tc>
+        <w:tc>
+          <w:tcPr>
+            <w:tcW w:type="dxa" w:w="1234"/>
+          </w:tcPr>
+          <w:p>
+            <w:pPr>
+              <w:spacing w:after="20" w:before="20"/>
+            </w:pPr>
+            <w:r/>
+            <w:r>
+              <w:rPr>
+                <w:b w:val="0"/>
+                <w:i w:val="0"/>
+                <w:sz w:val="17"/>
+              </w:rPr>
+              <w:t>Ficheiro de Processos</w:t>
+            </w:r>
+          </w:p>
+        </w:tc>
+      </w:tr>
+      <w:tr>
+        <w:tc>
+          <w:tcPr>
+            <w:tcW w:type="dxa" w:w="8638"/>
+            <w:gridSpan w:val="7"/>
+            <w:shd w:val="clear" w:color="auto" w:fill="D9E1F2"/>
+          </w:tcPr>
+          <w:p>
+            <w:pPr>
+              <w:spacing w:after="20" w:before="20"/>
+            </w:pPr>
+            <w:r/>
+            <w:r>
+              <w:rPr>
+                <w:b/>
+                <w:i w:val="0"/>
+                <w:sz w:val="18"/>
+              </w:rPr>
+              <w:t>Parâmetro: QUALIDADE — ponderação 35%</w:t>
+            </w:r>
+          </w:p>
+        </w:tc>
+      </w:tr>
+      <w:tr>
+        <w:tc>
+          <w:tcPr>
+            <w:tcW w:type="dxa" w:w="1234"/>
+          </w:tcPr>
+          <w:p>
+            <w:pPr>
+              <w:spacing w:after="20" w:before="20"/>
+            </w:pPr>
+            <w:r/>
+            <w:r>
+              <w:rPr>
+                <w:b w:val="0"/>
+                <w:i w:val="0"/>
+                <w:sz w:val="17"/>
+              </w:rPr>
+              <w:t>OOp 5. Garantir a satisfação dos utentes no atendimento</w:t>
+            </w:r>
+          </w:p>
+        </w:tc>
+        <w:tc>
+          <w:tcPr>
+            <w:tcW w:type="dxa" w:w="1234"/>
+          </w:tcPr>
+          <w:p>
+            <w:pPr>
+              <w:spacing w:after="20" w:before="20"/>
+            </w:pPr>
+            <w:r/>
+            <w:r>
+              <w:rPr>
+                <w:b w:val="0"/>
+                <w:i w:val="0"/>
+                <w:sz w:val="17"/>
+              </w:rPr>
+              <w:t>Satisfação média no atendimento (escala 1-5)</w:t>
+            </w:r>
+          </w:p>
+        </w:tc>
+        <w:tc>
+          <w:tcPr>
+            <w:tcW w:type="dxa" w:w="1234"/>
+          </w:tcPr>
+          <w:p>
+            <w:pPr>
+              <w:spacing w:after="20" w:before="20"/>
+            </w:pPr>
+            <w:r/>
+            <w:r>
+              <w:rPr>
+                <w:b w:val="0"/>
+                <w:i w:val="0"/>
+                <w:sz w:val="17"/>
+              </w:rPr>
+              <w:t>≥ 4,0</w:t>
+            </w:r>
+          </w:p>
+        </w:tc>
+        <w:tc>
+          <w:tcPr>
+            <w:tcW w:type="dxa" w:w="1234"/>
+          </w:tcPr>
+          <w:p>
+            <w:pPr>
+              <w:spacing w:after="20" w:before="20"/>
+            </w:pPr>
+            <w:r/>
+            <w:r>
+              <w:rPr>
+                <w:b w:val="0"/>
+                <w:i w:val="0"/>
+                <w:sz w:val="17"/>
+              </w:rPr>
+              <w:t>≥ 3,90</w:t>
+            </w:r>
+          </w:p>
+        </w:tc>
+        <w:tc>
+          <w:tcPr>
+            <w:tcW w:type="dxa" w:w="1234"/>
+          </w:tcPr>
+          <w:p>
+            <w:pPr>
+              <w:spacing w:after="20" w:before="20"/>
+            </w:pPr>
+            <w:r/>
+            <w:r>
+              <w:rPr>
+                <w:b w:val="0"/>
+                <w:i w:val="0"/>
+                <w:sz w:val="17"/>
+              </w:rPr>
+              <w:t>≥ 4,3</w:t>
+            </w:r>
+          </w:p>
+        </w:tc>
+        <w:tc>
+          <w:tcPr>
+            <w:tcW w:type="dxa" w:w="1234"/>
+          </w:tcPr>
+          <w:p>
+            <w:pPr>
+              <w:spacing w:after="20" w:before="20"/>
+            </w:pPr>
+            <w:r/>
+            <w:r>
+              <w:rPr>
+                <w:b w:val="0"/>
+                <w:i w:val="0"/>
+                <w:sz w:val="17"/>
+              </w:rPr>
+              <w:t>20%</w:t>
+            </w:r>
+          </w:p>
+        </w:tc>
+        <w:tc>
+          <w:tcPr>
+            <w:tcW w:type="dxa" w:w="1234"/>
+          </w:tcPr>
+          <w:p>
+            <w:pPr>
+              <w:spacing w:after="20" w:before="20"/>
+            </w:pPr>
+            <w:r/>
+            <w:r>
+              <w:rPr>
+                <w:b w:val="0"/>
+                <w:i w:val="0"/>
+                <w:sz w:val="17"/>
+              </w:rPr>
+              <w:t>Ficheiro de Atendimentos</w:t>
+            </w:r>
+          </w:p>
+        </w:tc>
+      </w:tr>
+      <w:tr>
+        <w:tc>
+          <w:tcPr>
+            <w:tcW w:type="dxa" w:w="1234"/>
+          </w:tcPr>
+          <w:p>
+            <w:pPr>
+              <w:spacing w:after="20" w:before="20"/>
+            </w:pPr>
+            <w:r/>
+            <w:r>
+              <w:rPr>
+                <w:b w:val="0"/>
+                <w:i w:val="0"/>
+                <w:sz w:val="17"/>
+              </w:rPr>
+              <w:t>OOp 6. Promover a utilização dos canais digitais</w:t>
+            </w:r>
+          </w:p>
+        </w:tc>
+        <w:tc>
+          <w:tcPr>
+            <w:tcW w:type="dxa" w:w="1234"/>
+          </w:tcPr>
+          <w:p>
+            <w:pPr>
+              <w:spacing w:after="20" w:before="20"/>
+            </w:pPr>
+            <w:r/>
+            <w:r>
+              <w:rPr>
+                <w:b w:val="0"/>
+                <w:i w:val="0"/>
+                <w:sz w:val="17"/>
+              </w:rPr>
+              <w:t>% de atendimentos por canais digitais (portal online + e-mail)</w:t>
+            </w:r>
+          </w:p>
+        </w:tc>
+        <w:tc>
+          <w:tcPr>
+            <w:tcW w:type="dxa" w:w="1234"/>
+          </w:tcPr>
+          <w:p>
+            <w:pPr>
+              <w:spacing w:after="20" w:before="20"/>
+            </w:pPr>
+            <w:r/>
+            <w:r>
+              <w:rPr>
+                <w:b w:val="0"/>
+                <w:i w:val="0"/>
+                <w:sz w:val="17"/>
+              </w:rPr>
               <w:t>≥ 60%</w:t>
             </w:r>
           </w:p>
         </w:tc>
         <w:tc>
           <w:tcPr>
-            <w:tcW w:type="dxa" w:w="1728"/>
+            <w:tcW w:type="dxa" w:w="1234"/>
           </w:tcPr>
           <w:p>
+            <w:pPr>
+              <w:spacing w:after="20" w:before="20"/>
+            </w:pPr>
+            <w:r/>
             <w:r>
+              <w:rPr>
+                <w:b w:val="0"/>
+                <w:i w:val="0"/>
+                <w:sz w:val="17"/>
+              </w:rPr>
+              <w:t>≥ 57%</w:t>
+            </w:r>
+          </w:p>
+        </w:tc>
+        <w:tc>
+          <w:tcPr>
+            <w:tcW w:type="dxa" w:w="1234"/>
+          </w:tcPr>
+          <w:p>
+            <w:pPr>
+              <w:spacing w:after="20" w:before="20"/>
+            </w:pPr>
+            <w:r/>
+            <w:r>
+              <w:rPr>
+                <w:b w:val="0"/>
+                <w:i w:val="0"/>
+                <w:sz w:val="17"/>
+              </w:rPr>
+              <w:t>≥ 65%</w:t>
+            </w:r>
+          </w:p>
+        </w:tc>
+        <w:tc>
+          <w:tcPr>
+            <w:tcW w:type="dxa" w:w="1234"/>
+          </w:tcPr>
+          <w:p>
+            <w:pPr>
+              <w:spacing w:after="20" w:before="20"/>
+            </w:pPr>
+            <w:r/>
+            <w:r>
+              <w:rPr>
+                <w:b w:val="0"/>
+                <w:i w:val="0"/>
+                <w:sz w:val="17"/>
+              </w:rPr>
               <w:t>15%</w:t>
+            </w:r>
+          </w:p>
+        </w:tc>
+        <w:tc>
+          <w:tcPr>
+            <w:tcW w:type="dxa" w:w="1234"/>
+          </w:tcPr>
+          <w:p>
+            <w:pPr>
+              <w:spacing w:after="20" w:before="20"/>
+            </w:pPr>
+            <w:r/>
+            <w:r>
+              <w:rPr>
+                <w:b w:val="0"/>
+                <w:i w:val="0"/>
+                <w:sz w:val="17"/>
+              </w:rPr>
+              <w:t>Ficheiro de Atendimentos</w:t>
             </w:r>
           </w:p>
         </w:tc>
       </w:tr>
     </w:tbl>
+    <w:p>
+      <w:r>
+        <w:rPr>
+          <w:b/>
+        </w:rPr>
+        <w:t xml:space="preserve">Como se lê o quadro. </w:t>
+      </w:r>
+      <w:r>
+        <w:t>A meta é o valor a atingir; a tolerância é o limite a partir do qual o objetivo se considera parcialmente cumprido; o valor crítico é o nível de superação. O grau de cumprimento (cumprido / parcialmente cumprido / não cumprido) não consta deste quadro: apura-se cruzando estas metas com a execução real registada nos ficheiros de Processos e de Atendimentos. As médias de prazos e de satisfação ponderam-se pelo volume.</w:t>
+      </w:r>
+    </w:p>
     <w:sectPr>
       <w:pgSz w:w="12240" w:h="15840"/>
       <w:pgMar w:top="1440" w:right="1800" w:bottom="1440" w:left="1800" w:header="720" w:footer="720" w:gutter="0"/>
@@ -714,6 +1494,10 @@
     <w:name w:val="Normal"/>
     <w:qFormat/>
     <w:rsid w:val="00FC693F"/>
+    <w:rPr>
+      <w:rFonts w:ascii="Calibri" w:hAnsi="Calibri"/>
+      <w:sz w:val="21"/>
+    </w:rPr>
   </w:style>
   <w:style w:type="paragraph" w:styleId="Header">
     <w:name w:val="header"/>

</xml_diff>